<commit_message>
Praktikum 4 K-Means: dataset kerentanan sosial-ekonomi (IPM BPS), notebook, laporan & sumber data
</commit_message>
<xml_diff>
--- a/Laporan_Praktikum4.docx
+++ b/Laporan_Praktikum4.docx
@@ -133,7 +133,16 @@
         <w:jc w:val="both"/>
       </w:pPr>
       <w:r>
-        <w:t>Dataset yang digunakan pada praktikum ini berisi data kondisi sosial-ekonomi dari 205 kabupaten/kota di Indonesia. Data bersumber dari Badan Pusat Statistik (BPS), yaitu empat komponen penyusun Indeks Pembangunan Manusia (IPM) Metode Baru: Umur Harapan Hidup (UHH), Harapan Lama Sekolah (HLS), Rata-rata Lama Sekolah (RLS), dan Pengeluaran per Kapita Disesuaikan. Keempat variabel tersebut mencerminkan aspek kesehatan, pendidikan, dan ekonomi suatu daerah, sehingga cocok digunakan untuk mengelompokkan tingkat kerentanan sosial-ekonomi antar wilayah.</w:t>
+        <w:t>Dataset yang digunakan pada praktikum ini berisi data kondisi sosial-ekonomi dari 205 kabupaten/kota di Indonesia. Data bersumber dari Badan Pusat Statistik (BPS), yaitu empat komponen penyusun Indeks Pembangunan Manusia (IPM) Metode Baru per kabupaten/kota: Umur Harapan Hidup (UHH), Harapan Lama Sekolah (HLS), Rata-rata Lama Sekolah (RLS), dan Pengeluaran per Kapita Disesuaikan. Keempat variabel tersebut mencerminkan aspek kesehatan, pendidikan, dan ekonomi suatu daerah, sehingga cocok digunakan untuk mengelompokkan tingkat kerentanan sosial-ekonomi antar wilayah.</w:t>
+      </w:r>
+    </w:p>
+    <w:p>
+      <w:pPr>
+        <w:spacing w:after="120"/>
+        <w:jc w:val="both"/>
+      </w:pPr>
+      <w:r>
+        <w:t>Dataset disiapkan dalam dua versi: versi belum di-encode (kategori kerentanan berupa teks: Rentan, Berkembang, Sejahtera) dan versi sudah di-encode (kategori berupa angka: 0, 1, 2). Versi angka inilah yang digunakan sebagai target pada proses klasifikasi.</w:t>
       </w:r>
     </w:p>
     <w:p>
@@ -142,7 +151,7 @@
           <w:i/>
           <w:color w:val="999999"/>
         </w:rPr>
-        <w:t>[ Sisipkan screenshot dataset (Kesejahteraan_Daerah.xlsx) di sini - Gambar 4.1 ]</w:t>
+        <w:t>[ Sisipkan screenshot dataset (Dataset_Awal_TanpaTarget.xlsx) di sini - Gambar 4.1 ]</w:t>
       </w:r>
     </w:p>
     <w:p>
@@ -177,7 +186,7 @@
         <w:jc w:val="both"/>
       </w:pPr>
       <w:r>
-        <w:t>Hasil klustering divisualisasikan dalam bentuk scatter plot dengan sumbu Rata-rata Lama Sekolah dan Pengeluaran per Kapita (dalam bentuk standarisasi). Warna yang berbeda menunjukkan kluster yang berbeda. Dataset yang telah diberi label kluster kemudian disimpan ke file KesejahteraanKluster.xlsx.</w:t>
+        <w:t>Hasil klustering divisualisasikan dalam bentuk scatter plot dengan sumbu Rata-rata Lama Sekolah dan Pengeluaran per Kapita (dalam bentuk standarisasi). Warna yang berbeda menunjukkan kluster yang berbeda. Dataset yang telah diberi label kluster kemudian disimpan ke dalam dua file (versi teks dan versi angka).</w:t>
       </w:r>
     </w:p>
     <w:p>
@@ -553,7 +562,7 @@
         <w:jc w:val="both"/>
       </w:pPr>
       <w:r>
-        <w:t>Berdasarkan hasil pengujian, ketiga algoritma memberikan tingkat akurasi yang sama, yaitu 95,12%, dengan 39 dari 41 data uji berhasil diprediksi dengan benar. Hal ini menunjukkan bahwa kluster yang terbentuk dari K-Means cukup terpisah dengan baik, sehingga mudah dikenali oleh berbagai model klasifikasi. Meskipun nilai akurasinya sama, ketiga algoritma memiliki karakteristik berbeda: Naive Bayes unggul dari sisi kesederhanaan dan kecepatan, SVM baik dalam memisahkan kelas dengan margin yang jelas, sedangkan Random Forest lebih tahan terhadap data yang kompleks karena menggabungkan banyak pohon keputusan.</w:t>
+        <w:t>Berdasarkan hasil pengujian, ketiga algoritma memberikan tingkat akurasi yang sama, yaitu 95,12%, dengan 39 dari 41 data uji berhasil diprediksi dengan benar. Hal ini menunjukkan bahwa kluster yang terbentuk dari K-Means cukup terpisah dengan baik sehingga mudah dikenali oleh berbagai model klasifikasi. Meskipun akurasinya sama, ketiga algoritma memiliki karakteristik berbeda: Naive Bayes unggul dari sisi kesederhanaan dan kecepatan, SVM baik dalam memisahkan kelas dengan margin yang jelas, sedangkan Random Forest tahan terhadap data kompleks karena menggabungkan banyak pohon keputusan.</w:t>
       </w:r>
     </w:p>
     <w:p>
@@ -579,7 +588,7 @@
         <w:jc w:val="both"/>
       </w:pPr>
       <w:r>
-        <w:t>Berdasarkan hasil praktikum, algoritma K-Means berhasil mengelompokkan 205 kabupaten/kota di Indonesia menjadi 3 kluster tingkat kerentanan sosial-ekonomi, yaitu Rentan, Berkembang, dan Sejahtera, berdasarkan komponen IPM (UHH, HLS, RLS, dan Pengeluaran per Kapita) dari data BPS. Label kluster tersebut kemudian digunakan sebagai target pada proses klasifikasi menggunakan Naive Bayes, Random Forest, dan Support Vector Machine (SVM). Ketiga algoritma memperoleh akurasi yang sama sebesar 95,12%, yang menandakan bahwa hasil klustering sudah cukup baik dan konsisten. Praktikum ini membantu memahami bagaimana metode unsupervised learning (klustering) dapat dipadukan dengan metode klasifikasi untuk menganalisis dan memetakan kondisi sosial-ekonomi daerah.</w:t>
+        <w:t>Berdasarkan hasil praktikum, algoritma K-Means berhasil mengelompokkan 205 kabupaten/kota di Indonesia menjadi 3 kluster tingkat kerentanan sosial-ekonomi, yaitu Rentan (102 daerah), Berkembang (66 daerah), dan Sejahtera (37 daerah), berdasarkan empat komponen IPM (UHH, HLS, RLS, dan Pengeluaran per Kapita) dari data BPS. Label kluster tersebut kemudian digunakan sebagai target pada proses klasifikasi menggunakan Naive Bayes, Random Forest, dan Support Vector Machine (SVM). Ketiga algoritma memperoleh akurasi yang sama sebesar 95,12%, yang menandakan hasil klustering sudah cukup baik dan konsisten. Praktikum ini membantu memahami bagaimana metode unsupervised learning (klustering) dapat dipadukan dengan metode klasifikasi untuk menganalisis dan memetakan kondisi sosial-ekonomi daerah.</w:t>
       </w:r>
     </w:p>
     <w:p>
@@ -594,7 +603,7 @@
           <w:i/>
           <w:sz w:val="18"/>
         </w:rPr>
-        <w:t>Sumber data: Badan Pusat Statistik (BPS) - Indeks Pembangunan Manusia Metode Baru menurut Kabupaten/Kota, www.bps.go.id (UHH 2024; HLS, RLS, Pengeluaran per Kapita 2025).</w:t>
+        <w:t>Sumber data: Badan Pusat Statistik (BPS), www.bps.go.id - Komponen Indeks Pembangunan Manusia Metode Baru menurut Kabupaten/Kota (UHH 2024; HLS, RLS, Pengeluaran per Kapita 2025).</w:t>
       </w:r>
     </w:p>
     <w:sectPr>

</xml_diff>